<commit_message>
Rewriting dokumentasi biar lebih natural
</commit_message>
<xml_diff>
--- a/docs/Laporan_Praktikum_Laravel.docx
+++ b/docs/Laporan_Praktikum_Laravel.docx
@@ -10,17 +10,17 @@
         <w:rPr>
           <w:sz w:val="40"/>
         </w:rPr>
-        <w:t>Dokumentasi Proyek — Laravel Blog + Admin Panel</w:t>
-      </w:r>
-    </w:p>
-    <w:p>
-      <w:r>
-        <w:t>Proyek hasil mengikuti kursus "Laravel 12 For Beginners: Your First Project" dari Laravel Daily (15 lesson), dikerjakan mulai dari nol (install) sampai selesai (validation).</w:t>
-      </w:r>
-    </w:p>
-    <w:p>
-      <w:r>
-        <w:t>Berbeda dengan kursus yang membuat dua project terpisah (blog + project Breeze), sesuai arahan guru proyek ini digabung dalam satu project: halaman blog publik dan panel admin (auth + CRUD) berada di project yang sama.</w:t>
+        <w:t>Dokumentasi Praktikum — Laravel Blog + Admin Panel</w:t>
+      </w:r>
+    </w:p>
+    <w:p>
+      <w:r>
+        <w:t>Project ini dibuat sambil ngikutin kursus "Laravel 12 For Beginners: Your First Project" dari Laravel Daily, dikerjain dari awal install sampe selesai bagian validation.</w:t>
+      </w:r>
+    </w:p>
+    <w:p>
+      <w:r>
+        <w:t>Di kursusnya, blog dan project admin (Breeze) sebenarnya dibuat jadi dua project terpisah. Tapi karena arahan gurunya digabung, di sini dua-duanya jadi satu project — halaman blog buat pengunjung dan panel admin (login, CRUD category &amp; post) ada di project yang sama.</w:t>
       </w:r>
     </w:p>
     <w:p>
@@ -28,12 +28,12 @@
         <w:pStyle w:val="Heading1"/>
       </w:pPr>
       <w:r>
-        <w:t>1. Teknologi / Lingkungan</w:t>
-      </w:r>
-    </w:p>
-    <w:p>
-      <w:r>
-        <w:t>Bukti versi perangkat yang digunakan:</w:t>
+        <w:t>1. Lingkungan / Tools yang Dipakai</w:t>
+      </w:r>
+    </w:p>
+    <w:p>
+      <w:r>
+        <w:t>Versi tools yang terpasang pas ngerjain project ini:</w:t>
       </w:r>
     </w:p>
     <w:p>
@@ -246,7 +246,7 @@
     </w:p>
     <w:p>
       <w:r>
-        <w:t>Dependency utama (dari composer.json):</w:t>
+        <w:t>Dependency utama (ada di composer.json):</w:t>
       </w:r>
     </w:p>
     <w:tbl>
@@ -396,7 +396,7 @@
               <w:rPr>
                 <w:sz w:val="20"/>
               </w:rPr>
-              <w:t>Debugbar untuk memeriksa query (Step 13)</w:t>
+              <w:t>Debugbar buat ngelihat query (Step 13)</w:t>
             </w:r>
           </w:p>
         </w:tc>
@@ -405,7 +405,7 @@
     <w:p/>
     <w:p>
       <w:r>
-        <w:t>Database yang dipakai: SQLite (database/database.sqlite). Frontend: Tailwind CSS v4 (via Vite) untuk halaman admin, dan CDN Tailwind untuk halaman blog.</w:t>
+        <w:t>Database-nya pake SQLite (database/database.sqlite). Untuk tampilan, halaman admin pake Tailwind CSS v4 lewat Vite, sedangkan halaman blog pake Tailwind dari CDN.</w:t>
       </w:r>
     </w:p>
     <w:p>
@@ -421,7 +421,7 @@
         <w:pStyle w:val="Heading2"/>
       </w:pPr>
       <w:r>
-        <w:t>Blog (Publik, tanpa login)</w:t>
+        <w:t>Blog (publik, gak perlu login)</w:t>
       </w:r>
     </w:p>
     <w:p>
@@ -429,7 +429,7 @@
         <w:pStyle w:val="ListBullet"/>
       </w:pPr>
       <w:r>
-        <w:t>Halaman utama: daftar **Latest Posts** + sidebar **Categories** (filter `/?category_id={id}`)</w:t>
+        <w:t>Halaman utama: daftar **Latest Posts** + sidebar **Categories**, bisa difilter pake `/?category_id={id}`</w:t>
       </w:r>
     </w:p>
     <w:p>
@@ -437,7 +437,7 @@
         <w:pStyle w:val="ListBullet"/>
       </w:pPr>
       <w:r>
-        <w:t>Halaman `about`, `contact`, `article`, dan halaman post per ID (`/posts/{post}`)</w:t>
+        <w:t>Halaman `about`, `contact`, `article`, dan halaman detail post per ID (`/posts/{post}`)</w:t>
       </w:r>
     </w:p>
     <w:p>
@@ -445,7 +445,7 @@
         <w:pStyle w:val="ListBullet"/>
       </w:pPr>
       <w:r>
-        <w:t>Data dari database via **Eloquent**</w:t>
+        <w:t>Datanya diambil dari database pake **Eloquent**</w:t>
       </w:r>
     </w:p>
     <w:p>
@@ -453,7 +453,7 @@
         <w:pStyle w:val="Heading2"/>
       </w:pPr>
       <w:r>
-        <w:t>Autentikasi &amp; Admin (Login dulu)</w:t>
+        <w:t>Autentikasi &amp; Admin (harus login dulu)</w:t>
       </w:r>
     </w:p>
     <w:p>
@@ -493,7 +493,7 @@
         <w:pStyle w:val="ListBullet"/>
       </w:pPr>
       <w:r>
-        <w:t>**Form validation** pada form create post</w:t>
+        <w:t>**Validasi form** di halaman create post</w:t>
       </w:r>
     </w:p>
     <w:p>
@@ -683,7 +683,7 @@
           <w:rFonts w:ascii="Consolas" w:hAnsi="Consolas"/>
           <w:sz w:val="18"/>
         </w:rPr>
-        <w:t>npm run build                 # atau npm run dev (buka terminal lain)</w:t>
+        <w:t>npm run build                 # atau npm run dev (di terminal terpisah)</w:t>
       </w:r>
     </w:p>
     <w:p>
@@ -735,7 +735,7 @@
           <w:rFonts w:ascii="Consolas" w:hAnsi="Consolas"/>
           <w:sz w:val="18"/>
         </w:rPr>
-        <w:t># Buka http://127.0.0.1:8000</w:t>
+        <w:t># buka http://127.0.0.1:8000</w:t>
       </w:r>
     </w:p>
     <w:p>
@@ -743,12 +743,12 @@
         <w:pStyle w:val="Heading2"/>
       </w:pPr>
       <w:r>
-        <w:t>Akun &amp; Data contoh</w:t>
-      </w:r>
-    </w:p>
-    <w:p>
-      <w:r>
-        <w:t>Akun admin (sudah dibuat saat praktik):</w:t>
+        <w:t>Akun &amp; Data Contoh</w:t>
+      </w:r>
+    </w:p>
+    <w:p>
+      <w:r>
+        <w:t>Akun admin yang udah dibuat pas praktik:</w:t>
       </w:r>
     </w:p>
     <w:tbl>
@@ -892,7 +892,7 @@
     <w:p/>
     <w:p>
       <w:r>
-        <w:t>Buat user lain lewat form /register. Untuk menjadikan user sebagai admin:</w:t>
+        <w:t>Buat user lain lewat form /register. Kalo mau dijadikan admin:</w:t>
       </w:r>
     </w:p>
     <w:p>
@@ -936,7 +936,7 @@
     </w:p>
     <w:p>
       <w:r>
-        <w:t>Data kategori &amp; post contoh (Category 1–4 dan Post 1–4) dibuat langsung lewat database saat praktik. Karena database/database.sqlite masuk .gitignore, data tersebut tidak ikut di-push. Cara menanam ulang (contoh via tinker):</w:t>
+        <w:t>Data contoh (Category 1–4 dan Post 1–4) dibuat manual langsung di database pas praktik. Karena database/database.sqlite masuk .gitignore, data itu gak ikut ke-push. Kalo mau ditanam ulang, contohnya gini:</w:t>
       </w:r>
     </w:p>
     <w:p>
@@ -962,7 +962,7 @@
           <w:rFonts w:ascii="Consolas" w:hAnsi="Consolas"/>
           <w:sz w:val="18"/>
         </w:rPr>
-        <w:t>// ... dst, lalu:</w:t>
+        <w:t>// ... dan seterusnya sampai Category 4, lalu:</w:t>
       </w:r>
     </w:p>
     <w:p>
@@ -988,12 +988,12 @@
           <w:rFonts w:ascii="Consolas" w:hAnsi="Consolas"/>
           <w:sz w:val="18"/>
         </w:rPr>
-        <w:t>// ... dst</w:t>
-      </w:r>
-    </w:p>
-    <w:p>
-      <w:r>
-        <w:t>&gt; Setelah migrate, hapus baris -- create table di bawah ini hanya diingat: gunakan perintah di atas. Data contoh bersifat opsional.</w:t>
+        <w:t>// ... dan seterusnya</w:t>
+      </w:r>
+    </w:p>
+    <w:p>
+      <w:r>
+        <w:t>Data contoh ini sifatnya opsional, yang penting projectnya jalan dulu.</w:t>
       </w:r>
     </w:p>
     <w:p>
@@ -1006,7 +1006,7 @@
     </w:p>
     <w:p>
       <w:r>
-        <w:t>&gt; Semua command di bawah adalah yang benar-benar dijalankan, dan hasilnya diverifikasi langsung lewat browser / Invoke-WebRequest (HTTP status code). Bukti screenshot ada di folder docs/bukti/.</w:t>
+        <w:t>Semua command di bawah beneran dijalanin di terminal, dan hasilnya dicek langsung lewat browser atau Invoke-WebRequest (status HTTP code). Bukti screenshotnya ada di folder docs/bukti/.</w:t>
       </w:r>
     </w:p>
     <w:p>
@@ -1019,12 +1019,7 @@
     </w:p>
     <w:p>
       <w:r>
-        <w:t>Tujuan: Menyiapkan tools (PHP, Composer, Node) dan membuat project Laravel baru.</w:t>
-      </w:r>
-    </w:p>
-    <w:p>
-      <w:r>
-        <w:t>Perintah:</w:t>
+        <w:t>Nyiapin tools (PHP, Composer, Node) dan bikin project Laravel baru.</w:t>
       </w:r>
     </w:p>
     <w:p>
@@ -1055,7 +1050,7 @@
     </w:p>
     <w:p>
       <w:r>
-        <w:t>Hasil: Folder project berisi struktur Laravel 12 (app, bootstrap, config, database, public, resources, routes, storage, tests, vendor).</w:t>
+        <w:t>Hasilnya keluar folder project lengkap dengan struktur Laravel 12 (app, bootstrap, config, database, public, resources, routes, storage, tests, vendor).</w:t>
       </w:r>
     </w:p>
     <w:p>
@@ -1068,12 +1063,7 @@
     </w:p>
     <w:p>
       <w:r>
-        <w:t>Tujuan: Belajar menulis route dan membuat halaman sederhana.</w:t>
-      </w:r>
-    </w:p>
-    <w:p>
-      <w:r>
-        <w:t>Perintah / kode:</w:t>
+        <w:t>Belajar nulis route dan bikin halaman sederhana.</w:t>
       </w:r>
     </w:p>
     <w:p>
@@ -1104,12 +1094,12 @@
     </w:p>
     <w:p>
       <w:r>
-        <w:t>File: routes/web.php, resources/views/home.blade.php</w:t>
-      </w:r>
-    </w:p>
-    <w:p>
-      <w:r>
-        <w:t>Hasil: / menampilkan halaman home. Status: GET / → 200.</w:t>
+        <w:t>File yang dibuat: routes/web.php, resources/views/home.blade.php</w:t>
+      </w:r>
+    </w:p>
+    <w:p>
+      <w:r>
+        <w:t>Hasil: / nampilin halaman home. Status GET / → 200.</w:t>
       </w:r>
     </w:p>
     <w:p>
@@ -1122,12 +1112,7 @@
     </w:p>
     <w:p>
       <w:r>
-        <w:t>Tujuan: Mendesain homepage dengan Tailwind CSS.</w:t>
-      </w:r>
-    </w:p>
-    <w:p>
-      <w:r>
-        <w:t>Perintah:</w:t>
+        <w:t>Desain homepage pake Tailwind CSS.</w:t>
       </w:r>
     </w:p>
     <w:p>
@@ -1158,12 +1143,7 @@
     </w:p>
     <w:p>
       <w:r>
-        <w:t>Kode: home.blade.php memuat Tailwind via CDN lalu diganti dengan @vite([...]) (CSS di-compile).</w:t>
-      </w:r>
-    </w:p>
-    <w:p>
-      <w:r>
-        <w:t>Hasil: Homepage tampil dengan styling Tailwind. Status: GET / → 200.</w:t>
+        <w:t>home.blade.php awalnya pake Tailwind CDN, terus diganti pake @vite([...]) biar CSS-nya di-compile. Hasilnya homepage udah rapi, GET / → 200.</w:t>
       </w:r>
     </w:p>
     <w:p>
@@ -1176,12 +1156,7 @@
     </w:p>
     <w:p>
       <w:r>
-        <w:t>Tujuan: Membuat layout utama (@yield) agar header/footer tidak diulang di tiap halaman.</w:t>
-      </w:r>
-    </w:p>
-    <w:p>
-      <w:r>
-        <w:t>Perintah / kode:</w:t>
+        <w:t>Bikin layout utama biar header/footer gak ditulis ulang di tiap halaman.</w:t>
       </w:r>
     </w:p>
     <w:p>
@@ -1243,7 +1218,7 @@
     </w:p>
     <w:p>
       <w:r>
-        <w:t>Hasil: Navigasi antar halaman via route name. Status: /about → 200, /contact → 200.</w:t>
+        <w:t>Hasil: navigasi antar halaman pake route name. /about → 200, /contact → 200.</w:t>
       </w:r>
     </w:p>
     <w:p>
@@ -1256,12 +1231,7 @@
     </w:p>
     <w:p>
       <w:r>
-        <w:t>Tujuan: Layout blog dengan sidebar, memakai asset() untuk gambar.</w:t>
-      </w:r>
-    </w:p>
-    <w:p>
-      <w:r>
-        <w:t>Perintah / kode:</w:t>
+        <w:t>Layout blog dengan sidebar, pake asset() buat gambar.</w:t>
       </w:r>
     </w:p>
     <w:p>
@@ -1292,12 +1262,12 @@
     </w:p>
     <w:p>
       <w:r>
-        <w:t>File: resources/views/layouts/blog.blade.php, home.blade.php, article.blade.php, about.blade.php, contact.blade.php; gambar di public/images/placeholder-150x150.png dan placeholder-800x400.png.</w:t>
-      </w:r>
-    </w:p>
-    <w:p>
-      <w:r>
-        <w:t>Hasil: Desain blog (My Blog + menu About Us/Contact) tampil. Status: /article → 200.</w:t>
+        <w:t>File: resources/views/layouts/blog.blade.php, home.blade.php, article.blade.php, about.blade.php, contact.blade.php; gambarnya di public/images/placeholder-150x150.png dan placeholder-800x400.png.</w:t>
+      </w:r>
+    </w:p>
+    <w:p>
+      <w:r>
+        <w:t>Hasil: desain blog (My Blog + menu About Us/Contact) tampil. /article → 200.</w:t>
       </w:r>
     </w:p>
     <w:p>
@@ -1310,12 +1280,7 @@
     </w:p>
     <w:p>
       <w:r>
-        <w:t>Tujuan: Membuat tabel categories dan posts via migration.</w:t>
-      </w:r>
-    </w:p>
-    <w:p>
-      <w:r>
-        <w:t>Perintah:</w:t>
+        <w:t>Bikin tabel categories dan posts pake migration.</w:t>
       </w:r>
     </w:p>
     <w:p>
@@ -1364,7 +1329,7 @@
     </w:p>
     <w:p>
       <w:r>
-        <w:t>Hasil:</w:t>
+        <w:t>Hasil di terminal:</w:t>
       </w:r>
     </w:p>
     <w:p>
@@ -1416,12 +1381,7 @@
     </w:p>
     <w:p>
       <w:r>
-        <w:t>Tujuan: Membuat Model + Controller, mengambil data dari DB dengan Eloquent.</w:t>
-      </w:r>
-    </w:p>
-    <w:p>
-      <w:r>
-        <w:t>Perintah:</w:t>
+        <w:t>Bikin Model + Controller, dan ngambil data dari DB pake Eloquent.</w:t>
       </w:r>
     </w:p>
     <w:p>
@@ -1465,7 +1425,7 @@
     </w:p>
     <w:p>
       <w:r>
-        <w:t>Kode inti:</w:t>
+        <w:t>Kode intinya:</w:t>
       </w:r>
     </w:p>
     <w:p>
@@ -1605,7 +1565,7 @@
     </w:p>
     <w:p>
       <w:r>
-        <w:t>Hasil: GET / → 200 menampilkan posts &amp; categories dari database.</w:t>
+        <w:t>Hasil: GET / → 200, halaman utama nampilin posts &amp; categories dari database.</w:t>
       </w:r>
     </w:p>
     <w:p>
@@ -1618,12 +1578,7 @@
     </w:p>
     <w:p>
       <w:r>
-        <w:t>Tujuan: Relasi belongsTo (Post → Category) dan filtering lewat GET parameter.</w:t>
-      </w:r>
-    </w:p>
-    <w:p>
-      <w:r>
-        <w:t>Kode:</w:t>
+        <w:t>Relasi belongsTo (Post → Category) dan filtering lewat GET parameter.</w:t>
       </w:r>
     </w:p>
     <w:p>
@@ -1693,7 +1648,7 @@
     </w:p>
     <w:p>
       <w:r>
-        <w:t>Hasil: Filter GET /?category_id=2 hanya menampilkan post kategori 2. Terverifikasi: halaman berisi Post 2, tidak berisi Post 1.</w:t>
+        <w:t>Hasil: GET /?category_id=2 cuma nampilin post dari kategori 2. Dicek di browser, halamannya berisi Post 2 dan gak ada Post 1.</w:t>
       </w:r>
     </w:p>
     <w:p>
@@ -1706,12 +1661,7 @@
     </w:p>
     <w:p>
       <w:r>
-        <w:t>Tujuan: Halaman detail post per ID dengan route model binding.</w:t>
-      </w:r>
-    </w:p>
-    <w:p>
-      <w:r>
-        <w:t>Perintah / kode:</w:t>
+        <w:t>Halaman detail post per ID pake route model binding.</w:t>
       </w:r>
     </w:p>
     <w:p>
@@ -1846,12 +1796,12 @@
     </w:p>
     <w:p>
       <w:r>
-        <w:t>Hasil: GET /posts/1 → 200, /posts/999 → 404.</w:t>
-      </w:r>
-    </w:p>
-    <w:p>
-      <w:r>
-        <w:t>&gt; Catatan gabungan project: whereNumber('post') ditambahkan agar /posts/create (halaman admin step 13) tidak tertangkap route blog posts/{post}.</w:t>
+        <w:t>Hasil: GET /posts/1 → 200, dan /posts/999 → 404.</w:t>
+      </w:r>
+    </w:p>
+    <w:p>
+      <w:r>
+        <w:t>&gt; Catatan (karena project digabung): whereNumber('post') ditambah biar /posts/create (halaman admin di step 13) gak ketangkap sama route blog posts/{post}.</w:t>
       </w:r>
     </w:p>
     <w:p>
@@ -1864,12 +1814,7 @@
     </w:p>
     <w:p>
       <w:r>
-        <w:t>Tujuan: Memasang autentikasi (login/register/dashboard) dengan Laravel Breeze.</w:t>
-      </w:r>
-    </w:p>
-    <w:p>
-      <w:r>
-        <w:t>Perintah:</w:t>
+        <w:t>Pasang autentikasi (login/register/dashboard) pake Laravel Breeze.</w:t>
       </w:r>
     </w:p>
     <w:p>
@@ -1931,7 +1876,7 @@
     </w:p>
     <w:p>
       <w:r>
-        <w:t>Hasil: /login → 200, /register → 200, /dashboard → redirect ke /login (harus login dulu).</w:t>
+        <w:t>Hasil: /login → 200, /register → 200, sedangkan /dashboard ngelunjak ke /login kalo belum login.</w:t>
       </w:r>
     </w:p>
     <w:p>
@@ -1944,12 +1889,7 @@
     </w:p>
     <w:p>
       <w:r>
-        <w:t>Tujuan: CRUD kategori di panel admin.</w:t>
-      </w:r>
-    </w:p>
-    <w:p>
-      <w:r>
-        <w:t>Perintah:</w:t>
+        <w:t>CRUD kategori di panel admin.</w:t>
       </w:r>
     </w:p>
     <w:p>
@@ -1972,7 +1912,7 @@
     </w:p>
     <w:p>
       <w:r>
-        <w:t>Kode inti:</w:t>
+        <w:t>Kode intinya:</w:t>
       </w:r>
     </w:p>
     <w:p>
@@ -2042,7 +1982,7 @@
     </w:p>
     <w:p>
       <w:r>
-        <w:t>Hasil (login sebagai admin): /categories → 200 (tabel kategori), create → 302 redirect ke index, edit &amp; delete jalan. Tanpa login → redirect ke /login.</w:t>
+        <w:t>Hasil (login sebagai admin): /categories → 200 nampilin tabel kategori, tambah data → 302 balik ke index, edit &amp; delete jalan. Kalo belum login → disuruh login dulu.</w:t>
       </w:r>
     </w:p>
     <w:p>
@@ -2055,12 +1995,7 @@
     </w:p>
     <w:p>
       <w:r>
-        <w:t>Tujuan: Kolom is_admin, custom middleware, dan melindungi route kategori hanya untuk admin.</w:t>
-      </w:r>
-    </w:p>
-    <w:p>
-      <w:r>
-        <w:t>Perintah:</w:t>
+        <w:t>Nambahin kolom is_admin, bikin custom middleware, dan melindungi route kategori biar cuma admin yang bisa akses.</w:t>
       </w:r>
     </w:p>
     <w:p>
@@ -2104,7 +2039,7 @@
     </w:p>
     <w:p>
       <w:r>
-        <w:t>Kode:</w:t>
+        <w:t>Kodenya:</w:t>
       </w:r>
     </w:p>
     <w:p>
@@ -2317,12 +2252,12 @@
     </w:p>
     <w:p>
       <w:r>
-        <w:t>File: migrasi add_is_admin_to_users_table, IsAdminMiddleware.php, routes/web.php, navigasi dengan @if(auth()-&gt;user()-&gt;is_admin).</w:t>
-      </w:r>
-    </w:p>
-    <w:p>
-      <w:r>
-        <w:t>Hasil terverifikasi:</w:t>
+        <w:t>File: migrasi add_is_admin_to_users_table, IsAdminMiddleware.php, routes/web.php, dan navigasi yang pake @if(auth()-&gt;user()-&gt;is_admin).</w:t>
+      </w:r>
+    </w:p>
+    <w:p>
+      <w:r>
+        <w:t>Hasil yang dicek:</w:t>
       </w:r>
     </w:p>
     <w:p>
@@ -2330,7 +2265,7 @@
         <w:pStyle w:val="ListBullet"/>
       </w:pPr>
       <w:r>
-        <w:t>Admin (`admin@example.com`) akses `/categories` → `200`</w:t>
+        <w:t>Admin (`admin@example.com`) buka `/categories` → `200`</w:t>
       </w:r>
     </w:p>
     <w:p>
@@ -2338,7 +2273,7 @@
         <w:pStyle w:val="ListBullet"/>
       </w:pPr>
       <w:r>
-        <w:t>User biasa akses `/categories` → `403 Forbidden`</w:t>
+        <w:t>User biasa buka `/categories` → `403 Forbidden`</w:t>
       </w:r>
     </w:p>
     <w:p>
@@ -2346,12 +2281,12 @@
         <w:pStyle w:val="ListBullet"/>
       </w:pPr>
       <w:r>
-        <w:t>Menu Categories/Posts hanya tampil untuk admin</w:t>
-      </w:r>
-    </w:p>
-    <w:p>
-      <w:r>
-        <w:t>&gt; Catatan gabungan project: -&gt;except(['show']) dipakai karena route posts/{post} sudah dipakai halaman post publik blog (step 9).</w:t>
+        <w:t>Menu Categories/Posts cuma muncul di user admin</w:t>
+      </w:r>
+    </w:p>
+    <w:p>
+      <w:r>
+        <w:t>&gt; Catatan (karena project digabung): -&gt;except(['show']) dipake soalnya route posts/{post} udah kepake sama halaman post publik blog (step 9).</w:t>
       </w:r>
     </w:p>
     <w:p>
@@ -2364,12 +2299,7 @@
     </w:p>
     <w:p>
       <w:r>
-        <w:t>Tujuan: CRUD posts + eager loading + memasang Debugbar untuk melihat query.</w:t>
-      </w:r>
-    </w:p>
-    <w:p>
-      <w:r>
-        <w:t>Perintah:</w:t>
+        <w:t>CRUD posts + eager loading + pasang Debugbar buat ngelihat query.</w:t>
       </w:r>
     </w:p>
     <w:p>
@@ -2483,12 +2413,12 @@
     </w:p>
     <w:p>
       <w:r>
-        <w:t>File: PostController.php, resources/views/posts/{index,create,edit}.blade.php, relasi category() di Post.php, navigasi link "Posts".</w:t>
-      </w:r>
-    </w:p>
-    <w:p>
-      <w:r>
-        <w:t>Hasil terverifikasi:</w:t>
+        <w:t>File: PostController.php, resources/views/posts/{index,create,edit}.blade.php, relasi category() di Post.php, link "Posts" di navigasi.</w:t>
+      </w:r>
+    </w:p>
+    <w:p>
+      <w:r>
+        <w:t>Hasil yang dicek:</w:t>
       </w:r>
     </w:p>
     <w:p>
@@ -2504,7 +2434,7 @@
         <w:pStyle w:val="ListBullet"/>
       </w:pPr>
       <w:r>
-        <w:t>CRUD create/update/delete post jalan (HTTP 302 → redirect ke index)</w:t>
+        <w:t>CRUD create/update/delete post jalan (302 → balik ke index)</w:t>
       </w:r>
     </w:p>
     <w:p>
@@ -2512,7 +2442,7 @@
         <w:pStyle w:val="ListBullet"/>
       </w:pPr>
       <w:r>
-        <w:t>Debugbar muncul (terlihat bar di bawah halaman + `phpdebugbar` di HTML)</w:t>
+        <w:t>Debugbar muncul (ada bar di bawah halaman + `phpdebugbar` di HTML)</w:t>
       </w:r>
     </w:p>
     <w:p>
@@ -2520,7 +2450,7 @@
         <w:pStyle w:val="ListBullet"/>
       </w:pPr>
       <w:r>
-        <w:t>User biasa akses `/posts` → `403`</w:t>
+        <w:t>User biasa buka `/posts` → `403`</w:t>
       </w:r>
     </w:p>
     <w:p>
@@ -2533,12 +2463,7 @@
     </w:p>
     <w:p>
       <w:r>
-        <w:t>Tujuan: Validasi backend dan menampilkan pesan error.</w:t>
-      </w:r>
-    </w:p>
-    <w:p>
-      <w:r>
-        <w:t>Perintah:</w:t>
+        <w:t>Validasi di sisi backend dan nampilin pesan error.</w:t>
       </w:r>
     </w:p>
     <w:p>
@@ -2556,7 +2481,7 @@
     </w:p>
     <w:p>
       <w:r>
-        <w:t>Kode:</w:t>
+        <w:t>Kodenya:</w:t>
       </w:r>
     </w:p>
     <w:p>
@@ -2951,7 +2876,7 @@
     </w:p>
     <w:p>
       <w:r>
-        <w:t>Hasil terverifikasi:</w:t>
+        <w:t>Hasil yang dicek:</w:t>
       </w:r>
     </w:p>
     <w:p>
@@ -2959,7 +2884,7 @@
         <w:pStyle w:val="ListBullet"/>
       </w:pPr>
       <w:r>
-        <w:t>Submit form kosong → `302` redirect balik ke `/posts/create` dan muncul pesan *"The title field is required."*, *"The text field is required."*</w:t>
+        <w:t>Submit form kosong → `302` balik ke `/posts/create` dan muncul pesan *"The title field is required."*, *"The text field is required."*</w:t>
       </w:r>
     </w:p>
     <w:p>
@@ -2967,7 +2892,7 @@
         <w:pStyle w:val="ListBullet"/>
       </w:pPr>
       <w:r>
-        <w:t>Submit form valid → post berhasil dibuat (`302` → `/posts`)</w:t>
+        <w:t>Submit form yang diisi bener → post kebuat (302 → `/posts`)</w:t>
       </w:r>
     </w:p>
     <w:p>
@@ -2980,7 +2905,7 @@
     </w:p>
     <w:p>
       <w:r>
-        <w:t>Tujuan: Penutup. Proyek selesai 15/15.</w:t>
+        <w:t>Penutup dari kursus, project udah selesai 15/15.</w:t>
       </w:r>
     </w:p>
     <w:p>
@@ -3253,7 +3178,7 @@
     </w:p>
     <w:p>
       <w:r>
-        <w:t>Karena blog &amp; admin digabung dalam satu project (sesuai arahan guru), ada penyesuaian kecil yang tidak ada di tutorial (di tutorial dua project terpisah):</w:t>
+        <w:t>Karena blog &amp; admin digabung dalam satu project (sesuai arahan guru), ada penyesuaian kecil yang di tutorial gak ada (di tutorial dua projectnya dipisah):</w:t>
       </w:r>
     </w:p>
     <w:p>
@@ -3261,7 +3186,7 @@
         <w:pStyle w:val="ListNumber"/>
       </w:pPr>
       <w:r>
-        <w:t>**`posts/{post}` (blog) vs resource `posts` (admin)** — keduanya memakai URI yang sama. Solusi: resource posts memakai `-&gt;except(['show'])` agar halaman post publik tetap jalan.</w:t>
+        <w:t>**`posts/{post}` (blog) vs resource `posts` (admin)** — dua-duanya pake URI yang sama. Solusinya resource posts dikasih `-&gt;except(['show'])` biar halaman post publik tetep jalan.</w:t>
       </w:r>
     </w:p>
     <w:p>
@@ -3269,7 +3194,7 @@
         <w:pStyle w:val="ListNumber"/>
       </w:pPr>
       <w:r>
-        <w:t>**`/posts/create` ketangkap route blog** — route blog diberi `-&gt;whereNumber('post')` agar hanya mencocokkan ID angka.</w:t>
+        <w:t>**`/posts/create` ketangkap route blog** — route blog dikasih `-&gt;whereNumber('post')` biar cuma cocok sama ID angka.</w:t>
       </w:r>
     </w:p>
     <w:p>
@@ -3277,7 +3202,7 @@
         <w:pStyle w:val="ListNumber"/>
       </w:pPr>
       <w:r>
-        <w:t>**Server `php artisan serve` menyimpan route lama di memori** (karena `opcache.enable_cli=On`) — setiap mengubah route, restart server (`Ctrl+C` lalu `php artisan serve`) dan jalankan `php artisan optimize:clear`.</w:t>
+        <w:t>**Server `php artisan serve` nyimpen route lama di memori** (karena `opcache.enable_cli=On`) — tiap ganti route, server harus di-restart (`Ctrl+C` lalu `php artisan serve`) dan jalankan `php artisan optimize:clear`.</w:t>
       </w:r>
     </w:p>
     <w:p>
@@ -3290,7 +3215,7 @@
     </w:p>
     <w:p>
       <w:r>
-        <w:t>Bukti diambil langsung dari layar (browser dibuka lalu di-screenshot, dan command dijalankan beneran di terminal lalu output-nya disimpan). File ada di folder docs/bukti/:</w:t>
+        <w:t>Buktinya diambil langsung dari layar — browser dibuka beneran terus di-screenshot, dan command-nya dijalanin beneran di terminal lalu output-nya disimpen. Filenya ada di folder docs/bukti/:</w:t>
       </w:r>
     </w:p>
     <w:p>
@@ -3362,7 +3287,7 @@
         <w:pStyle w:val="ListBullet"/>
       </w:pPr>
       <w:r>
-        <w:t>`bukti-08-dashboard.png` — dashboard (setelah login) — *bisa diambil manual*</w:t>
+        <w:t>`bukti-08-dashboard.png` — dashboard setelah login sebagai admin</w:t>
       </w:r>
     </w:p>
     <w:p>
@@ -3370,7 +3295,7 @@
         <w:pStyle w:val="ListBullet"/>
       </w:pPr>
       <w:r>
-        <w:t>`bukti-09-categories.png` — halaman CRUD categories (admin) — *bisa diambil manual*</w:t>
+        <w:t>`bukti-09-categories.png` — halaman CRUD categories (admin)</w:t>
       </w:r>
     </w:p>
     <w:p>
@@ -3378,7 +3303,7 @@
         <w:pStyle w:val="ListBullet"/>
       </w:pPr>
       <w:r>
-        <w:t>`bukti-10-posts.png` — halaman CRUD posts (admin) — *bisa diambil manual*</w:t>
+        <w:t>`bukti-10-posts.png` — halaman CRUD posts (admin)</w:t>
       </w:r>
     </w:p>
     <w:sectPr>

</xml_diff>

<commit_message>
Bahasa dokumentasi disesuaikan biar natural
</commit_message>
<xml_diff>
--- a/docs/Laporan_Praktikum_Laravel.docx
+++ b/docs/Laporan_Praktikum_Laravel.docx
@@ -15,12 +15,12 @@
     </w:p>
     <w:p>
       <w:r>
-        <w:t>Project ini dibuat sambil ngikutin kursus "Laravel 12 For Beginners: Your First Project" dari Laravel Daily, dikerjain dari awal install sampe selesai bagian validation.</w:t>
-      </w:r>
-    </w:p>
-    <w:p>
-      <w:r>
-        <w:t>Di kursusnya, blog dan project admin (Breeze) sebenarnya dibuat jadi dua project terpisah. Tapi karena arahan gurunya digabung, di sini dua-duanya jadi satu project — halaman blog buat pengunjung dan panel admin (login, CRUD category &amp; post) ada di project yang sama.</w:t>
+        <w:t>Project ini kubuat sambil ngikutin kursus "Laravel 12 For Beginners: Your First Project" dari Laravel Daily, dari nol sampe selesai bagian validation.</w:t>
+      </w:r>
+    </w:p>
+    <w:p>
+      <w:r>
+        <w:t>Di kursusnya itu sebenarnya blog sama project admin (Breeze) dibuat jadi dua project terpisah. Nah, karena kata guru disuruh digabung, jadi di sini dua-duanya kugabung jadi satu project — halaman blog buat pengunjung sama panel admin (login, CRUD category &amp; post) ada di project yang sama.</w:t>
       </w:r>
     </w:p>
     <w:p>
@@ -405,7 +405,7 @@
     <w:p/>
     <w:p>
       <w:r>
-        <w:t>Database-nya pake SQLite (database/database.sqlite). Untuk tampilan, halaman admin pake Tailwind CSS v4 lewat Vite, sedangkan halaman blog pake Tailwind dari CDN.</w:t>
+        <w:t>Databasenya pake SQLite (database/database.sqlite). Soal tampilan, halaman admin pake Tailwind CSS v4 lewat Vite, kalo halaman blog pake Tailwind dari CDN.</w:t>
       </w:r>
     </w:p>
     <w:p>
@@ -453,7 +453,7 @@
         <w:pStyle w:val="Heading2"/>
       </w:pPr>
       <w:r>
-        <w:t>Autentikasi &amp; Admin (harus login dulu)</w:t>
+        <w:t>Autentikasi &amp; Admin (login dulu)</w:t>
       </w:r>
     </w:p>
     <w:p>
@@ -748,7 +748,7 @@
     </w:p>
     <w:p>
       <w:r>
-        <w:t>Akun admin yang udah dibuat pas praktik:</w:t>
+        <w:t>Akun admin yang udah kubuat pas praktik:</w:t>
       </w:r>
     </w:p>
     <w:tbl>
@@ -936,7 +936,7 @@
     </w:p>
     <w:p>
       <w:r>
-        <w:t>Data contoh (Category 1–4 dan Post 1–4) dibuat manual langsung di database pas praktik. Karena database/database.sqlite masuk .gitignore, data itu gak ikut ke-push. Kalo mau ditanam ulang, contohnya gini:</w:t>
+        <w:t>Data contoh (Category 1–4 dan Post 1–4) kubuat manual langsung di database pas praktik. Soalnya database/database.sqlite masuk .gitignore, datanya gak ikut ke-push. Kalo mau ditanam ulang, contohnya gini:</w:t>
       </w:r>
     </w:p>
     <w:p>
@@ -962,7 +962,7 @@
           <w:rFonts w:ascii="Consolas" w:hAnsi="Consolas"/>
           <w:sz w:val="18"/>
         </w:rPr>
-        <w:t>// ... dan seterusnya sampai Category 4, lalu:</w:t>
+        <w:t>// ... sampe Category 4, lalu:</w:t>
       </w:r>
     </w:p>
     <w:p>
@@ -993,7 +993,7 @@
     </w:p>
     <w:p>
       <w:r>
-        <w:t>Data contoh ini sifatnya opsional, yang penting projectnya jalan dulu.</w:t>
+        <w:t>Data contoh ini opsional, yang penting projectnya jalan dulu.</w:t>
       </w:r>
     </w:p>
     <w:p>
@@ -1006,7 +1006,7 @@
     </w:p>
     <w:p>
       <w:r>
-        <w:t>Semua command di bawah beneran dijalanin di terminal, dan hasilnya dicek langsung lewat browser atau Invoke-WebRequest (status HTTP code). Bukti screenshotnya ada di folder docs/bukti/.</w:t>
+        <w:t>Semua command di bawah beneran kujalankan di terminal, terus hasilnya kucek langsung lewat browser atau Invoke-WebRequest (status HTTP code). Bukti screenshot-nya ada di folder docs/bukti/.</w:t>
       </w:r>
     </w:p>
     <w:p>
@@ -1019,7 +1019,7 @@
     </w:p>
     <w:p>
       <w:r>
-        <w:t>Nyiapin tools (PHP, Composer, Node) dan bikin project Laravel baru.</w:t>
+        <w:t>Nyiapin tools (PHP, Composer, Node) terus bikin project Laravel baru.</w:t>
       </w:r>
     </w:p>
     <w:p>
@@ -1050,7 +1050,7 @@
     </w:p>
     <w:p>
       <w:r>
-        <w:t>Hasilnya keluar folder project lengkap dengan struktur Laravel 12 (app, bootstrap, config, database, public, resources, routes, storage, tests, vendor).</w:t>
+        <w:t>Hasilnya keluar folder project lengkap pake struktur Laravel 12 (app, bootstrap, config, database, public, resources, routes, storage, tests, vendor).</w:t>
       </w:r>
     </w:p>
     <w:p>
@@ -1156,7 +1156,7 @@
     </w:p>
     <w:p>
       <w:r>
-        <w:t>Bikin layout utama biar header/footer gak ditulis ulang di tiap halaman.</w:t>
+        <w:t>Bikin layout utama biar header/footer gak nulis ulang di tiap halaman.</w:t>
       </w:r>
     </w:p>
     <w:p>
@@ -1231,7 +1231,7 @@
     </w:p>
     <w:p>
       <w:r>
-        <w:t>Layout blog dengan sidebar, pake asset() buat gambar.</w:t>
+        <w:t>Layout blog pake sidebar, pake asset() buat gambar.</w:t>
       </w:r>
     </w:p>
     <w:p>
@@ -1267,7 +1267,7 @@
     </w:p>
     <w:p>
       <w:r>
-        <w:t>Hasil: desain blog (My Blog + menu About Us/Contact) tampil. /article → 200.</w:t>
+        <w:t>Hasil: desain blog (My Blog + menu About Us/Contact) udah keliatan. /article → 200.</w:t>
       </w:r>
     </w:p>
     <w:p>
@@ -1381,7 +1381,7 @@
     </w:p>
     <w:p>
       <w:r>
-        <w:t>Bikin Model + Controller, dan ngambil data dari DB pake Eloquent.</w:t>
+        <w:t>Bikin Model + Controller, terus ngambil data dari DB pake Eloquent.</w:t>
       </w:r>
     </w:p>
     <w:p>
@@ -1648,7 +1648,7 @@
     </w:p>
     <w:p>
       <w:r>
-        <w:t>Hasil: GET /?category_id=2 cuma nampilin post dari kategori 2. Dicek di browser, halamannya berisi Post 2 dan gak ada Post 1.</w:t>
+        <w:t>Hasil: GET /?category_id=2 cuma nampilin post dari kategori 2. Waktu dicek di browser, isinya Post 2 dan gak ada Post 1.</w:t>
       </w:r>
     </w:p>
     <w:p>
@@ -1801,7 +1801,7 @@
     </w:p>
     <w:p>
       <w:r>
-        <w:t>&gt; Catatan (karena project digabung): whereNumber('post') ditambah biar /posts/create (halaman admin di step 13) gak ketangkap sama route blog posts/{post}.</w:t>
+        <w:t>&gt; Catatan (soalnya project digabung): whereNumber('post') kutambah biar /posts/create (halaman admin di step 13) gak ketangkap sama route blog posts/{post}.</w:t>
       </w:r>
     </w:p>
     <w:p>
@@ -1876,7 +1876,7 @@
     </w:p>
     <w:p>
       <w:r>
-        <w:t>Hasil: /login → 200, /register → 200, sedangkan /dashboard ngelunjak ke /login kalo belum login.</w:t>
+        <w:t>Hasil: /login → 200, /register → 200, kalo /dashboard belum login langsung dilempar ke /login.</w:t>
       </w:r>
     </w:p>
     <w:p>
@@ -1982,7 +1982,7 @@
     </w:p>
     <w:p>
       <w:r>
-        <w:t>Hasil (login sebagai admin): /categories → 200 nampilin tabel kategori, tambah data → 302 balik ke index, edit &amp; delete jalan. Kalo belum login → disuruh login dulu.</w:t>
+        <w:t>Hasil (login sebagai admin): /categories → 200 nampilin tabel kategori, tambah data → 302 balik ke index, edit &amp; delete jalan. Kalo belum login, disuruh login dulu.</w:t>
       </w:r>
     </w:p>
     <w:p>
@@ -1995,7 +1995,7 @@
     </w:p>
     <w:p>
       <w:r>
-        <w:t>Nambahin kolom is_admin, bikin custom middleware, dan melindungi route kategori biar cuma admin yang bisa akses.</w:t>
+        <w:t>Nambahin kolom is_admin, bikin custom middleware, terus ngejagain route kategori biar cuma admin yang bisa akses.</w:t>
       </w:r>
     </w:p>
     <w:p>
@@ -2286,7 +2286,7 @@
     </w:p>
     <w:p>
       <w:r>
-        <w:t>&gt; Catatan (karena project digabung): -&gt;except(['show']) dipake soalnya route posts/{post} udah kepake sama halaman post publik blog (step 9).</w:t>
+        <w:t>&gt; Catatan (soalnya project digabung): -&gt;except(['show']) kupake soalnya route posts/{post} udah kepake sama halaman post publik blog (step 9).</w:t>
       </w:r>
     </w:p>
     <w:p>
@@ -3178,7 +3178,7 @@
     </w:p>
     <w:p>
       <w:r>
-        <w:t>Karena blog &amp; admin digabung dalam satu project (sesuai arahan guru), ada penyesuaian kecil yang di tutorial gak ada (di tutorial dua projectnya dipisah):</w:t>
+        <w:t>Karena blog &amp; admin digabung jadi satu project (sesuai arahan guru), ada penyesuaian kecil yang di tutorial gak ada (soalnya di tutorial dua project-nya dipisah):</w:t>
       </w:r>
     </w:p>
     <w:p>
@@ -3215,7 +3215,7 @@
     </w:p>
     <w:p>
       <w:r>
-        <w:t>Buktinya diambil langsung dari layar — browser dibuka beneran terus di-screenshot, dan command-nya dijalanin beneran di terminal lalu output-nya disimpen. Filenya ada di folder docs/bukti/:</w:t>
+        <w:t>Buktinya kuambil langsung dari layar — browser dibuka beneran terus di-screenshot, dan command-nya kujalankan beneran di terminal terus output-nya kusimpen. Filenya ada di folder docs/bukti/:</w:t>
       </w:r>
     </w:p>
     <w:p>

</xml_diff>